<commit_message>
chore: update deployed link to scamshield-ai-woad.vercel.app
</commit_message>
<xml_diff>
--- a/ScamShield_AI_Hackathon_Specification.docx
+++ b/ScamShield_AI_Hackathon_Specification.docx
@@ -4,23 +4,53 @@
   <w:body>
     <w:p>
       <w:pPr>
+        <w:spacing w:before="720"/>
+      </w:pPr>
+    </w:p>
+    <w:p>
+      <w:pPr>
         <w:jc w:val="center"/>
       </w:pPr>
       <w:r>
         <w:rPr>
-          <w:sz w:val="72"/>
+          <w:rFonts w:ascii="Calibri" w:hAnsi="Calibri"/>
+          <w:b/>
+          <w:color w:val="0284C7"/>
+          <w:sz w:val="20"/>
         </w:rPr>
-        <w:t>🛡️</w:t>
-        <w:br/>
+        <w:t>HACKATHON INNOVATION SPECIFICATION &amp; PROPOSAL</w:t>
       </w:r>
+    </w:p>
+    <w:p>
+      <w:pPr>
+        <w:spacing w:before="240" w:after="160"/>
+        <w:jc w:val="center"/>
+      </w:pPr>
       <w:r>
         <w:rPr>
           <w:rFonts w:ascii="Calibri" w:hAnsi="Calibri"/>
           <w:b/>
-          <w:color w:val="0F172A"/>
-          <w:sz w:val="56"/>
+          <w:color w:val="0A192F"/>
+          <w:sz w:val="68"/>
         </w:rPr>
         <w:t>ScamShield AI</w:t>
+      </w:r>
+    </w:p>
+    <w:p>
+      <w:pPr>
+        <w:spacing w:after="480"/>
+        <w:jc w:val="center"/>
+      </w:pPr>
+      <w:r>
+        <w:rPr>
+          <w:rFonts w:ascii="Calibri" w:hAnsi="Calibri"/>
+          <w:i/>
+          <w:color w:val="1E293B"/>
+          <w:sz w:val="28"/>
+        </w:rPr>
+        <w:t>Digital Public Safety Intelligence Platform</w:t>
+        <w:br/>
+        <w:t>Real-Time Interception of Digital Arrest Scams &amp; Communication Fraud</w:t>
       </w:r>
     </w:p>
     <w:p>
@@ -29,59 +59,466 @@
       </w:pPr>
       <w:r>
         <w:rPr>
-          <w:rFonts w:ascii="Calibri" w:hAnsi="Calibri"/>
-          <w:i/>
           <w:color w:val="0284C7"/>
-          <w:sz w:val="28"/>
         </w:rPr>
-        <w:t>Digital Public Safety Intelligence Platform</w:t>
-        <w:br/>
-        <w:t>Technical &amp; Executive Specification</w:t>
+        <w:t>━━━━━━━━━━━━━━━━━━━━━━━━━━━━━━━━━━━━━━━━━━━━</w:t>
       </w:r>
     </w:p>
     <w:p>
       <w:pPr>
-        <w:spacing w:after="240"/>
+        <w:spacing w:before="960"/>
+      </w:pPr>
+    </w:p>
+    <w:tbl>
+      <w:tblPr>
+        <w:tblW w:type="auto" w:w="0"/>
+        <w:jc w:val="center"/>
+        <w:tblLook w:firstColumn="1" w:firstRow="1" w:lastColumn="0" w:lastRow="0" w:noHBand="0" w:noVBand="1" w:val="04A0"/>
+      </w:tblPr>
+      <w:tblGrid>
+        <w:gridCol w:w="4680"/>
+        <w:gridCol w:w="4680"/>
+      </w:tblGrid>
+      <w:tr>
+        <w:tc>
+          <w:tcPr>
+            <w:tcW w:type="dxa" w:w="4680"/>
+            <w:shd w:fill="F8FAFC"/>
+            <w:tcMar>
+              <w:top w:w="120" w:type="dxa"/>
+              <w:bottom w:w="120" w:type="dxa"/>
+              <w:left w:w="200" w:type="dxa"/>
+              <w:right w:w="200" w:type="dxa"/>
+            </w:tcMar>
+          </w:tcPr>
+          <w:p>
+            <w:pPr>
+              <w:spacing w:after="40"/>
+            </w:pPr>
+            <w:r>
+              <w:rPr>
+                <w:b/>
+                <w:color w:val="0A192F"/>
+              </w:rPr>
+              <w:t>Project Lead / Author:</w:t>
+            </w:r>
+          </w:p>
+        </w:tc>
+        <w:tc>
+          <w:tcPr>
+            <w:tcW w:type="dxa" w:w="4680"/>
+            <w:shd w:fill="F8FAFC"/>
+            <w:tcMar>
+              <w:top w:w="120" w:type="dxa"/>
+              <w:bottom w:w="120" w:type="dxa"/>
+              <w:left w:w="200" w:type="dxa"/>
+              <w:right w:w="200" w:type="dxa"/>
+            </w:tcMar>
+          </w:tcPr>
+          <w:p>
+            <w:pPr>
+              <w:spacing w:after="40"/>
+            </w:pPr>
+            <w:r>
+              <w:rPr>
+                <w:color w:val="334155"/>
+              </w:rPr>
+              <w:t>Suryansh Sugara</w:t>
+            </w:r>
+          </w:p>
+        </w:tc>
+      </w:tr>
+      <w:tr>
+        <w:tc>
+          <w:tcPr>
+            <w:tcW w:type="dxa" w:w="4680"/>
+            <w:shd w:fill="F8FAFC"/>
+            <w:tcMar>
+              <w:top w:w="120" w:type="dxa"/>
+              <w:bottom w:w="120" w:type="dxa"/>
+              <w:left w:w="200" w:type="dxa"/>
+              <w:right w:w="200" w:type="dxa"/>
+            </w:tcMar>
+          </w:tcPr>
+          <w:p>
+            <w:pPr>
+              <w:spacing w:after="40"/>
+            </w:pPr>
+            <w:r>
+              <w:rPr>
+                <w:b/>
+                <w:color w:val="0A192F"/>
+              </w:rPr>
+              <w:t>Repository URL:</w:t>
+            </w:r>
+          </w:p>
+        </w:tc>
+        <w:tc>
+          <w:tcPr>
+            <w:tcW w:type="dxa" w:w="4680"/>
+            <w:shd w:fill="F8FAFC"/>
+            <w:tcMar>
+              <w:top w:w="120" w:type="dxa"/>
+              <w:bottom w:w="120" w:type="dxa"/>
+              <w:left w:w="200" w:type="dxa"/>
+              <w:right w:w="200" w:type="dxa"/>
+            </w:tcMar>
+          </w:tcPr>
+          <w:p>
+            <w:pPr>
+              <w:spacing w:after="40"/>
+            </w:pPr>
+            <w:r>
+              <w:rPr>
+                <w:color w:val="0284C7"/>
+              </w:rPr>
+              <w:t>https://github.com/suryanshsugara/scamshield-ai</w:t>
+            </w:r>
+          </w:p>
+        </w:tc>
+      </w:tr>
+      <w:tr>
+        <w:tc>
+          <w:tcPr>
+            <w:tcW w:type="dxa" w:w="4680"/>
+            <w:shd w:fill="F8FAFC"/>
+            <w:tcMar>
+              <w:top w:w="120" w:type="dxa"/>
+              <w:bottom w:w="120" w:type="dxa"/>
+              <w:left w:w="200" w:type="dxa"/>
+              <w:right w:w="200" w:type="dxa"/>
+            </w:tcMar>
+          </w:tcPr>
+          <w:p>
+            <w:pPr>
+              <w:spacing w:after="40"/>
+            </w:pPr>
+            <w:r>
+              <w:rPr>
+                <w:b/>
+                <w:color w:val="0A192F"/>
+              </w:rPr>
+              <w:t>Live Web Deployment:</w:t>
+            </w:r>
+          </w:p>
+        </w:tc>
+        <w:tc>
+          <w:tcPr>
+            <w:tcW w:type="dxa" w:w="4680"/>
+            <w:shd w:fill="F8FAFC"/>
+            <w:tcMar>
+              <w:top w:w="120" w:type="dxa"/>
+              <w:bottom w:w="120" w:type="dxa"/>
+              <w:left w:w="200" w:type="dxa"/>
+              <w:right w:w="200" w:type="dxa"/>
+            </w:tcMar>
+          </w:tcPr>
+          <w:p>
+            <w:pPr>
+              <w:spacing w:after="40"/>
+            </w:pPr>
+            <w:r>
+              <w:rPr>
+                <w:color w:val="0284C7"/>
+              </w:rPr>
+              <w:t>https://suryanshsugara.github.io/scamshield-ai/</w:t>
+            </w:r>
+          </w:p>
+        </w:tc>
+      </w:tr>
+      <w:tr>
+        <w:tc>
+          <w:tcPr>
+            <w:tcW w:type="dxa" w:w="4680"/>
+            <w:shd w:fill="F8FAFC"/>
+            <w:tcMar>
+              <w:top w:w="120" w:type="dxa"/>
+              <w:bottom w:w="120" w:type="dxa"/>
+              <w:left w:w="200" w:type="dxa"/>
+              <w:right w:w="200" w:type="dxa"/>
+            </w:tcMar>
+          </w:tcPr>
+          <w:p>
+            <w:pPr>
+              <w:spacing w:after="40"/>
+            </w:pPr>
+            <w:r>
+              <w:rPr>
+                <w:b/>
+                <w:color w:val="0A192F"/>
+              </w:rPr>
+              <w:t>Technology Stack:</w:t>
+            </w:r>
+          </w:p>
+        </w:tc>
+        <w:tc>
+          <w:tcPr>
+            <w:tcW w:type="dxa" w:w="4680"/>
+            <w:shd w:fill="F8FAFC"/>
+            <w:tcMar>
+              <w:top w:w="120" w:type="dxa"/>
+              <w:bottom w:w="120" w:type="dxa"/>
+              <w:left w:w="200" w:type="dxa"/>
+              <w:right w:w="200" w:type="dxa"/>
+            </w:tcMar>
+          </w:tcPr>
+          <w:p>
+            <w:pPr>
+              <w:spacing w:after="40"/>
+            </w:pPr>
+            <w:r>
+              <w:rPr>
+                <w:color w:val="334155"/>
+              </w:rPr>
+              <w:t>Next.js 14, FastAPI, WebSockets, Gemini AI, Docker</w:t>
+            </w:r>
+          </w:p>
+        </w:tc>
+      </w:tr>
+      <w:tr>
+        <w:tc>
+          <w:tcPr>
+            <w:tcW w:type="dxa" w:w="4680"/>
+            <w:shd w:fill="F8FAFC"/>
+            <w:tcMar>
+              <w:top w:w="120" w:type="dxa"/>
+              <w:bottom w:w="120" w:type="dxa"/>
+              <w:left w:w="200" w:type="dxa"/>
+              <w:right w:w="200" w:type="dxa"/>
+            </w:tcMar>
+          </w:tcPr>
+          <w:p>
+            <w:pPr>
+              <w:spacing w:after="40"/>
+            </w:pPr>
+            <w:r>
+              <w:rPr>
+                <w:b/>
+                <w:color w:val="0A192F"/>
+              </w:rPr>
+              <w:t>Date &amp; Version:</w:t>
+            </w:r>
+          </w:p>
+        </w:tc>
+        <w:tc>
+          <w:tcPr>
+            <w:tcW w:type="dxa" w:w="4680"/>
+            <w:shd w:fill="F8FAFC"/>
+            <w:tcMar>
+              <w:top w:w="120" w:type="dxa"/>
+              <w:bottom w:w="120" w:type="dxa"/>
+              <w:left w:w="200" w:type="dxa"/>
+              <w:right w:w="200" w:type="dxa"/>
+            </w:tcMar>
+          </w:tcPr>
+          <w:p>
+            <w:pPr>
+              <w:spacing w:after="40"/>
+            </w:pPr>
+            <w:r>
+              <w:rPr>
+                <w:color w:val="334155"/>
+              </w:rPr>
+              <w:t>July 2026 | Version 2.0 Production Ready</w:t>
+            </w:r>
+          </w:p>
+        </w:tc>
+      </w:tr>
+    </w:tbl>
+    <w:p>
+      <w:r>
+        <w:br w:type="page"/>
+      </w:r>
+    </w:p>
+    <w:p>
+      <w:pPr>
+        <w:keepNext/>
+        <w:spacing w:before="440" w:after="160"/>
+      </w:pPr>
+      <w:r>
+        <w:rPr>
+          <w:rFonts w:ascii="Calibri" w:hAnsi="Calibri"/>
+          <w:b/>
+          <w:color w:val="0A192F"/>
+          <w:sz w:val="36"/>
+        </w:rPr>
+        <w:t>Chapter 1: Executive Summary &amp; Strategic Vision</w:t>
+      </w:r>
+    </w:p>
+    <w:p>
+      <w:r>
+        <w:t>ScamShield AI is an advanced, real-time public safety intelligence platform engineered to combat the exponential rise of organized digital fraud in India. Integrating speech-to-text NLP analysis, graph neural network visualization, and multi-model AI fallbacks, ScamShield AI intercepts coercive scams mid-execution to safeguard citizens before financial transfer occurs.</w:t>
+      </w:r>
+    </w:p>
+    <w:tbl>
+      <w:tblPr>
+        <w:tblW w:type="auto" w:w="0"/>
+        <w:jc w:val="center"/>
+        <w:tblLook w:firstColumn="1" w:firstRow="1" w:lastColumn="0" w:lastRow="0" w:noHBand="0" w:noVBand="1" w:val="04A0"/>
+      </w:tblPr>
+      <w:tblGrid>
+        <w:gridCol w:w="9360"/>
+      </w:tblGrid>
+      <w:tr>
+        <w:tc>
+          <w:tcPr>
+            <w:tcW w:type="dxa" w:w="9360"/>
+            <w:shd w:fill="F0F9FF"/>
+            <w:tcMar>
+              <w:top w:w="160" w:type="dxa"/>
+              <w:bottom w:w="160" w:type="dxa"/>
+              <w:left w:w="240" w:type="dxa"/>
+              <w:right w:w="200" w:type="dxa"/>
+            </w:tcMar>
+            <w:tcBorders>
+              <w:top w:val="none" w:sz="4" w:space="0" w:color="auto"/>
+              <w:left w:val="single" w:sz="24" w:space="0" w:color="0284C7"/>
+              <w:bottom w:val="none" w:sz="4" w:space="0" w:color="auto"/>
+              <w:right w:val="none" w:sz="4" w:space="0" w:color="auto"/>
+            </w:tcBorders>
+          </w:tcPr>
+          <w:p>
+            <w:pPr>
+              <w:spacing w:after="80"/>
+            </w:pPr>
+            <w:r>
+              <w:rPr>
+                <w:b/>
+                <w:color w:val="0284C7"/>
+                <w:sz w:val="20"/>
+              </w:rPr>
+              <w:t>💡 PARADIGM SHIFT: REAL-TIME INTERCEPTION</w:t>
+              <w:br/>
+            </w:r>
+            <w:r>
+              <w:rPr>
+                <w:i/>
+                <w:color w:val="1E293B"/>
+                <w:sz w:val="21"/>
+              </w:rPr>
+              <w:t>Traditional fraud prevention tools operate post-facto (after victims transfer funds). ScamShield AI shifts the paradigm from reactive reporting to active real-time interception during live phone calls and messages.</w:t>
+            </w:r>
+          </w:p>
+        </w:tc>
+      </w:tr>
+    </w:tbl>
+    <w:p>
+      <w:pPr>
+        <w:spacing w:after="120"/>
       </w:pPr>
     </w:p>
     <w:p>
       <w:pPr>
         <w:keepNext/>
-        <w:spacing w:before="360" w:after="120"/>
-      </w:pPr>
-      <w:r>
-        <w:rPr>
-          <w:rFonts w:ascii="Calibri" w:hAnsi="Calibri"/>
-          <w:b/>
-          <w:color w:val="0F172A"/>
-          <w:sz w:val="36"/>
-        </w:rPr>
-        <w:t>1. Executive Summary &amp; Problem Analysis</w:t>
-      </w:r>
-    </w:p>
-    <w:p>
-      <w:r>
-        <w:t>Digital fraud in India has evolved into an organized criminal enterprise. The Indian Cyber Crime Coordination Centre (I4C) reported over 694,000 cybercrime complaints in 2024, representing financial losses exceeding ₹11,333 Crore ($1.35 Billion USD) in the first six months alone.</w:t>
-      </w:r>
-    </w:p>
-    <w:p>
-      <w:r>
-        <w:t>Among all fraud vectors, the 'Digital Arrest' scam is the most insidious. Perpetrators impersonate officials from the Central Bureau of Investigation (CBI), Narcotics Control Bureau (NCB), Enforcement Directorate (ED), or State Police departments. Victims are coerced into video calls, told that their identity or bank accounts are linked to illegal activities, and forced into continuous monitoring under threat of immediate physical arrest.</w:t>
-      </w:r>
-    </w:p>
-    <w:p>
-      <w:pPr>
-        <w:keepNext/>
-        <w:spacing w:before="280" w:after="80"/>
+        <w:spacing w:before="280" w:after="120"/>
       </w:pPr>
       <w:r>
         <w:rPr>
           <w:rFonts w:ascii="Calibri" w:hAnsi="Calibri"/>
           <w:b/>
           <w:color w:val="0284C7"/>
-          <w:sz w:val="28"/>
+          <w:sz w:val="26"/>
         </w:rPr>
-        <w:t>Quantitative Fraud Impact Matrix</w:t>
+        <w:t>Core Objectives &amp; System Metrics</w:t>
+      </w:r>
+    </w:p>
+    <w:p>
+      <w:pPr>
+        <w:pStyle w:val="ListBullet"/>
+        <w:spacing w:after="80" w:line="276" w:lineRule="auto"/>
+      </w:pPr>
+      <w:r>
+        <w:rPr>
+          <w:b/>
+          <w:color w:val="0A192F"/>
+        </w:rPr>
+        <w:t xml:space="preserve">1. Interception Window: </w:t>
+      </w:r>
+      <w:r>
+        <w:t>Eliminate the 2 to 6 hour window of fear exploitation during Digital Arrest scams.</w:t>
+      </w:r>
+    </w:p>
+    <w:p>
+      <w:pPr>
+        <w:pStyle w:val="ListBullet"/>
+        <w:spacing w:after="80" w:line="276" w:lineRule="auto"/>
+      </w:pPr>
+      <w:r>
+        <w:rPr>
+          <w:b/>
+          <w:color w:val="0A192F"/>
+        </w:rPr>
+        <w:t xml:space="preserve">2. Low Latency Engine: </w:t>
+      </w:r>
+      <w:r>
+        <w:t>Achieve sub-2-second evaluation latency across speech streaming WebSockets.</w:t>
+      </w:r>
+    </w:p>
+    <w:p>
+      <w:pPr>
+        <w:pStyle w:val="ListBullet"/>
+        <w:spacing w:after="80" w:line="276" w:lineRule="auto"/>
+      </w:pPr>
+      <w:r>
+        <w:rPr>
+          <w:b/>
+          <w:color w:val="0A192F"/>
+        </w:rPr>
+        <w:t xml:space="preserve">3. Universal Accessibility: </w:t>
+      </w:r>
+      <w:r>
+        <w:t>Provide multi-lingual intelligence in English and Hindi for maximum demographic reach.</w:t>
+      </w:r>
+    </w:p>
+    <w:p>
+      <w:pPr>
+        <w:pStyle w:val="ListBullet"/>
+        <w:spacing w:after="80" w:line="276" w:lineRule="auto"/>
+      </w:pPr>
+      <w:r>
+        <w:rPr>
+          <w:b/>
+          <w:color w:val="0A192F"/>
+        </w:rPr>
+        <w:t xml:space="preserve">4. Privacy Architecture: </w:t>
+      </w:r>
+      <w:r>
+        <w:t>Zero persistent message data logging to maintain 100% privacy compliance.</w:t>
+      </w:r>
+    </w:p>
+    <w:p>
+      <w:pPr>
+        <w:keepNext/>
+        <w:spacing w:before="440" w:after="160"/>
+      </w:pPr>
+      <w:r>
+        <w:rPr>
+          <w:rFonts w:ascii="Calibri" w:hAnsi="Calibri"/>
+          <w:b/>
+          <w:color w:val="0A192F"/>
+          <w:sz w:val="36"/>
+        </w:rPr>
+        <w:t>Chapter 2: Crisis Analysis — The Fraud Epidemic in India</w:t>
+      </w:r>
+    </w:p>
+    <w:p>
+      <w:r>
+        <w:t>According to the Indian Cyber Crime Coordination Centre (I4C) under the Ministry of Home Affairs, cybercrime complaints surpassed 694,000 cases in 2024. Total financial losses exceeded ₹11,333 Crore ($1.35 Billion USD) in just the first six months of 2024.</w:t>
+      </w:r>
+    </w:p>
+    <w:p>
+      <w:pPr>
+        <w:keepNext/>
+        <w:spacing w:before="280" w:after="120"/>
+      </w:pPr>
+      <w:r>
+        <w:rPr>
+          <w:rFonts w:ascii="Calibri" w:hAnsi="Calibri"/>
+          <w:b/>
+          <w:color w:val="0284C7"/>
+          <w:sz w:val="26"/>
+        </w:rPr>
+        <w:t>Empirical Fraud Vector Breakdown</w:t>
       </w:r>
     </w:p>
     <w:tbl>
@@ -100,7 +537,13 @@
         <w:tc>
           <w:tcPr>
             <w:tcW w:type="dxa" w:w="2340"/>
-            <w:shd w:fill="0F172A"/>
+            <w:tcMar>
+              <w:top w:w="140" w:type="dxa"/>
+              <w:bottom w:w="140" w:type="dxa"/>
+              <w:left w:w="180" w:type="dxa"/>
+              <w:right w:w="180" w:type="dxa"/>
+            </w:tcMar>
+            <w:shd w:fill="0A192F"/>
           </w:tcPr>
           <w:p>
             <w:r>
@@ -108,14 +551,20 @@
                 <w:b/>
                 <w:color w:val="FFFFFF"/>
               </w:rPr>
-              <w:t>Fraud Vector</w:t>
+              <w:t>Fraud Vector Category</w:t>
             </w:r>
           </w:p>
         </w:tc>
         <w:tc>
           <w:tcPr>
             <w:tcW w:type="dxa" w:w="2340"/>
-            <w:shd w:fill="0F172A"/>
+            <w:tcMar>
+              <w:top w:w="140" w:type="dxa"/>
+              <w:bottom w:w="140" w:type="dxa"/>
+              <w:left w:w="180" w:type="dxa"/>
+              <w:right w:w="180" w:type="dxa"/>
+            </w:tcMar>
+            <w:shd w:fill="0A192F"/>
           </w:tcPr>
           <w:p>
             <w:r>
@@ -123,14 +572,20 @@
                 <w:b/>
                 <w:color w:val="FFFFFF"/>
               </w:rPr>
-              <w:t>Annual Case Count</w:t>
+              <w:t>Annual Incident Count</w:t>
             </w:r>
           </w:p>
         </w:tc>
         <w:tc>
           <w:tcPr>
             <w:tcW w:type="dxa" w:w="2340"/>
-            <w:shd w:fill="0F172A"/>
+            <w:tcMar>
+              <w:top w:w="140" w:type="dxa"/>
+              <w:bottom w:w="140" w:type="dxa"/>
+              <w:left w:w="180" w:type="dxa"/>
+              <w:right w:w="180" w:type="dxa"/>
+            </w:tcMar>
+            <w:shd w:fill="0A192F"/>
           </w:tcPr>
           <w:p>
             <w:r>
@@ -138,14 +593,20 @@
                 <w:b/>
                 <w:color w:val="FFFFFF"/>
               </w:rPr>
-              <w:t>Avg Loss per Victim</w:t>
+              <w:t>Avg Financial Loss</w:t>
             </w:r>
           </w:p>
         </w:tc>
         <w:tc>
           <w:tcPr>
             <w:tcW w:type="dxa" w:w="2340"/>
-            <w:shd w:fill="0F172A"/>
+            <w:tcMar>
+              <w:top w:w="140" w:type="dxa"/>
+              <w:bottom w:w="140" w:type="dxa"/>
+              <w:left w:w="180" w:type="dxa"/>
+              <w:right w:w="180" w:type="dxa"/>
+            </w:tcMar>
+            <w:shd w:fill="0A192F"/>
           </w:tcPr>
           <w:p>
             <w:r>
@@ -153,7 +614,7 @@
                 <w:b/>
                 <w:color w:val="FFFFFF"/>
               </w:rPr>
-              <w:t>Psychological Mechanism</w:t>
+              <w:t>Primary Psychological Mechanism</w:t>
             </w:r>
           </w:p>
         </w:tc>
@@ -162,44 +623,68 @@
         <w:tc>
           <w:tcPr>
             <w:tcW w:type="dxa" w:w="2340"/>
+            <w:tcMar>
+              <w:top w:w="140" w:type="dxa"/>
+              <w:bottom w:w="140" w:type="dxa"/>
+              <w:left w:w="180" w:type="dxa"/>
+              <w:right w:w="180" w:type="dxa"/>
+            </w:tcMar>
             <w:shd w:fill="FFFFFF"/>
           </w:tcPr>
           <w:p>
             <w:r>
-              <w:t>Digital Arrest</w:t>
+              <w:t>Digital Arrest Scams</w:t>
             </w:r>
           </w:p>
         </w:tc>
         <w:tc>
           <w:tcPr>
             <w:tcW w:type="dxa" w:w="2340"/>
+            <w:tcMar>
+              <w:top w:w="140" w:type="dxa"/>
+              <w:bottom w:w="140" w:type="dxa"/>
+              <w:left w:w="180" w:type="dxa"/>
+              <w:right w:w="180" w:type="dxa"/>
+            </w:tcMar>
             <w:shd w:fill="FFFFFF"/>
           </w:tcPr>
           <w:p>
             <w:r>
-              <w:t>7,061 (2024)</w:t>
+              <w:t>7,061 cases (2024)</w:t>
             </w:r>
           </w:p>
         </w:tc>
         <w:tc>
           <w:tcPr>
             <w:tcW w:type="dxa" w:w="2340"/>
+            <w:tcMar>
+              <w:top w:w="140" w:type="dxa"/>
+              <w:bottom w:w="140" w:type="dxa"/>
+              <w:left w:w="180" w:type="dxa"/>
+              <w:right w:w="180" w:type="dxa"/>
+            </w:tcMar>
             <w:shd w:fill="FFFFFF"/>
           </w:tcPr>
           <w:p>
             <w:r>
-              <w:t>₹15.5 Lakhs</w:t>
+              <w:t>₹15.5 Lakhs / victim</w:t>
             </w:r>
           </w:p>
         </w:tc>
         <w:tc>
           <w:tcPr>
             <w:tcW w:type="dxa" w:w="2340"/>
+            <w:tcMar>
+              <w:top w:w="140" w:type="dxa"/>
+              <w:bottom w:w="140" w:type="dxa"/>
+              <w:left w:w="180" w:type="dxa"/>
+              <w:right w:w="180" w:type="dxa"/>
+            </w:tcMar>
             <w:shd w:fill="FFFFFF"/>
           </w:tcPr>
           <w:p>
             <w:r>
-              <w:t>Coercive fear &amp; authority pressure</w:t>
+              <w:t>Authority impersonation &amp; coercive fear</w:t>
             </w:r>
           </w:p>
         </w:tc>
@@ -208,44 +693,68 @@
         <w:tc>
           <w:tcPr>
             <w:tcW w:type="dxa" w:w="2340"/>
+            <w:tcMar>
+              <w:top w:w="140" w:type="dxa"/>
+              <w:bottom w:w="140" w:type="dxa"/>
+              <w:left w:w="180" w:type="dxa"/>
+              <w:right w:w="180" w:type="dxa"/>
+            </w:tcMar>
             <w:shd w:fill="F8FAFC"/>
           </w:tcPr>
           <w:p>
             <w:r>
-              <w:t>UPI / Payment Trap</w:t>
+              <w:t>UPI Payment Traps</w:t>
             </w:r>
           </w:p>
         </w:tc>
         <w:tc>
           <w:tcPr>
             <w:tcW w:type="dxa" w:w="2340"/>
+            <w:tcMar>
+              <w:top w:w="140" w:type="dxa"/>
+              <w:bottom w:w="140" w:type="dxa"/>
+              <w:left w:w="180" w:type="dxa"/>
+              <w:right w:w="180" w:type="dxa"/>
+            </w:tcMar>
             <w:shd w:fill="F8FAFC"/>
           </w:tcPr>
           <w:p>
             <w:r>
-              <w:t>312,000 (2024)</w:t>
+              <w:t>312,000 cases</w:t>
             </w:r>
           </w:p>
         </w:tc>
         <w:tc>
           <w:tcPr>
             <w:tcW w:type="dxa" w:w="2340"/>
+            <w:tcMar>
+              <w:top w:w="140" w:type="dxa"/>
+              <w:bottom w:w="140" w:type="dxa"/>
+              <w:left w:w="180" w:type="dxa"/>
+              <w:right w:w="180" w:type="dxa"/>
+            </w:tcMar>
             <w:shd w:fill="F8FAFC"/>
           </w:tcPr>
           <w:p>
             <w:r>
-              <w:t>₹42,000</w:t>
+              <w:t>₹42,000 / victim</w:t>
             </w:r>
           </w:p>
         </w:tc>
         <w:tc>
           <w:tcPr>
             <w:tcW w:type="dxa" w:w="2340"/>
+            <w:tcMar>
+              <w:top w:w="140" w:type="dxa"/>
+              <w:bottom w:w="140" w:type="dxa"/>
+              <w:left w:w="180" w:type="dxa"/>
+              <w:right w:w="180" w:type="dxa"/>
+            </w:tcMar>
             <w:shd w:fill="F8FAFC"/>
           </w:tcPr>
           <w:p>
             <w:r>
-              <w:t>Speed urgency &amp; cognitive overload</w:t>
+              <w:t>Urgency pressure &amp; cognitive overload</w:t>
             </w:r>
           </w:p>
         </w:tc>
@@ -254,44 +763,68 @@
         <w:tc>
           <w:tcPr>
             <w:tcW w:type="dxa" w:w="2340"/>
+            <w:tcMar>
+              <w:top w:w="140" w:type="dxa"/>
+              <w:bottom w:w="140" w:type="dxa"/>
+              <w:left w:w="180" w:type="dxa"/>
+              <w:right w:w="180" w:type="dxa"/>
+            </w:tcMar>
             <w:shd w:fill="FFFFFF"/>
           </w:tcPr>
           <w:p>
             <w:r>
-              <w:t>Phishing / Impersonation</w:t>
+              <w:t>Phishing &amp; URL Spools</w:t>
             </w:r>
           </w:p>
         </w:tc>
         <w:tc>
           <w:tcPr>
             <w:tcW w:type="dxa" w:w="2340"/>
+            <w:tcMar>
+              <w:top w:w="140" w:type="dxa"/>
+              <w:bottom w:w="140" w:type="dxa"/>
+              <w:left w:w="180" w:type="dxa"/>
+              <w:right w:w="180" w:type="dxa"/>
+            </w:tcMar>
             <w:shd w:fill="FFFFFF"/>
           </w:tcPr>
           <w:p>
             <w:r>
-              <w:t>185,000 (2024)</w:t>
+              <w:t>185,000 cases</w:t>
             </w:r>
           </w:p>
         </w:tc>
         <w:tc>
           <w:tcPr>
             <w:tcW w:type="dxa" w:w="2340"/>
+            <w:tcMar>
+              <w:top w:w="140" w:type="dxa"/>
+              <w:bottom w:w="140" w:type="dxa"/>
+              <w:left w:w="180" w:type="dxa"/>
+              <w:right w:w="180" w:type="dxa"/>
+            </w:tcMar>
             <w:shd w:fill="FFFFFF"/>
           </w:tcPr>
           <w:p>
             <w:r>
-              <w:t>₹88,000</w:t>
+              <w:t>₹88,000 / victim</w:t>
             </w:r>
           </w:p>
         </w:tc>
         <w:tc>
           <w:tcPr>
             <w:tcW w:type="dxa" w:w="2340"/>
+            <w:tcMar>
+              <w:top w:w="140" w:type="dxa"/>
+              <w:bottom w:w="140" w:type="dxa"/>
+              <w:left w:w="180" w:type="dxa"/>
+              <w:right w:w="180" w:type="dxa"/>
+            </w:tcMar>
             <w:shd w:fill="FFFFFF"/>
           </w:tcPr>
           <w:p>
             <w:r>
-              <w:t>Trust exploitation &amp; deceptive URLs</w:t>
+              <w:t>Brand deception &amp; credential harvesting</w:t>
             </w:r>
           </w:p>
         </w:tc>
@@ -300,39 +833,63 @@
         <w:tc>
           <w:tcPr>
             <w:tcW w:type="dxa" w:w="2340"/>
+            <w:tcMar>
+              <w:top w:w="140" w:type="dxa"/>
+              <w:bottom w:w="140" w:type="dxa"/>
+              <w:left w:w="180" w:type="dxa"/>
+              <w:right w:w="180" w:type="dxa"/>
+            </w:tcMar>
             <w:shd w:fill="F8FAFC"/>
           </w:tcPr>
           <w:p>
             <w:r>
-              <w:t>Investment / Stock Scams</w:t>
+              <w:t>Investment Fraud</w:t>
             </w:r>
           </w:p>
         </w:tc>
         <w:tc>
           <w:tcPr>
             <w:tcW w:type="dxa" w:w="2340"/>
+            <w:tcMar>
+              <w:top w:w="140" w:type="dxa"/>
+              <w:bottom w:w="140" w:type="dxa"/>
+              <w:left w:w="180" w:type="dxa"/>
+              <w:right w:w="180" w:type="dxa"/>
+            </w:tcMar>
             <w:shd w:fill="F8FAFC"/>
           </w:tcPr>
           <w:p>
             <w:r>
-              <w:t>98,000 (2024)</w:t>
+              <w:t>98,000 cases</w:t>
             </w:r>
           </w:p>
         </w:tc>
         <w:tc>
           <w:tcPr>
             <w:tcW w:type="dxa" w:w="2340"/>
+            <w:tcMar>
+              <w:top w:w="140" w:type="dxa"/>
+              <w:bottom w:w="140" w:type="dxa"/>
+              <w:left w:w="180" w:type="dxa"/>
+              <w:right w:w="180" w:type="dxa"/>
+            </w:tcMar>
             <w:shd w:fill="F8FAFC"/>
           </w:tcPr>
           <w:p>
             <w:r>
-              <w:t>₹4.2 Lakhs</w:t>
+              <w:t>₹4.2 Lakhs / victim</w:t>
             </w:r>
           </w:p>
         </w:tc>
         <w:tc>
           <w:tcPr>
             <w:tcW w:type="dxa" w:w="2340"/>
+            <w:tcMar>
+              <w:top w:w="140" w:type="dxa"/>
+              <w:bottom w:w="140" w:type="dxa"/>
+              <w:left w:w="180" w:type="dxa"/>
+              <w:right w:w="180" w:type="dxa"/>
+            </w:tcMar>
             <w:shd w:fill="F8FAFC"/>
           </w:tcPr>
           <w:p>
@@ -351,283 +908,1179 @@
     <w:p>
       <w:pPr>
         <w:keepNext/>
-        <w:spacing w:before="360" w:after="120"/>
+        <w:spacing w:before="280" w:after="120"/>
       </w:pPr>
       <w:r>
         <w:rPr>
           <w:rFonts w:ascii="Calibri" w:hAnsi="Calibri"/>
           <w:b/>
-          <w:color w:val="0F172A"/>
-          <w:sz w:val="36"/>
+          <w:color w:val="0284C7"/>
+          <w:sz w:val="26"/>
         </w:rPr>
-        <w:t>2. Biological &amp; Societal Context of Digital Arrest Scams</w:t>
+        <w:t>Anatomy of a Digital Arrest Scam</w:t>
       </w:r>
     </w:p>
     <w:p>
       <w:r>
-        <w:t>The success of digital arrest scams relies on exploiting human stress neurobiology. When a scammer claims to be a police officer threatening immediate imprisonment:</w:t>
+        <w:t>In a Digital Arrest scam, criminals contact victims via WhatsApp or Skype video calls while wearing fake police uniforms. They allege that a SIM card or Aadhaar number registered in the victim's name was used in drug smuggling, money laundering, or terrorist funding. Victims are ordered to remain on video surveillance without contacting family members and instructed to transfer funds into 'government verification accounts' to clear their name.</w:t>
+      </w:r>
+    </w:p>
+    <w:p>
+      <w:pPr>
+        <w:keepNext/>
+        <w:spacing w:before="440" w:after="160"/>
+      </w:pPr>
+      <w:r>
+        <w:rPr>
+          <w:rFonts w:ascii="Calibri" w:hAnsi="Calibri"/>
+          <w:b/>
+          <w:color w:val="0A192F"/>
+          <w:sz w:val="36"/>
+        </w:rPr>
+        <w:t>Chapter 3: Solution Architecture &amp; Core Innovations</w:t>
+      </w:r>
+    </w:p>
+    <w:p>
+      <w:r>
+        <w:t>ScamShield AI addresses the crisis by providing three synchronized protection modules:</w:t>
       </w:r>
     </w:p>
     <w:p>
       <w:pPr>
         <w:pStyle w:val="ListBullet"/>
-        <w:spacing w:after="60"/>
+        <w:spacing w:after="80" w:line="276" w:lineRule="auto"/>
       </w:pPr>
       <w:r>
-        <w:t>1. The victim's amygdala triggers a sympathetic nervous system fight-or-flight response.</w:t>
+        <w:rPr>
+          <w:b/>
+          <w:color w:val="0A192F"/>
+        </w:rPr>
+        <w:t xml:space="preserve">1. Live Call Scam Shield: </w:t>
+      </w:r>
+      <w:r>
+        <w:t>Real-time WebSocket speech transcript streaming with rolling risk scoring (0 to 100). Highlights coercive phrases such as 'CBI officer', 'digital arrest', and 'transfer money' instantly.</w:t>
       </w:r>
     </w:p>
     <w:p>
       <w:pPr>
         <w:pStyle w:val="ListBullet"/>
-        <w:spacing w:after="60"/>
+        <w:spacing w:after="80" w:line="276" w:lineRule="auto"/>
       </w:pPr>
       <w:r>
-        <w:t>2. Adrenaline and cortisol surge, suppressing executive functioning in the prefrontal cortex.</w:t>
+        <w:rPr>
+          <w:b/>
+          <w:color w:val="0A192F"/>
+        </w:rPr>
+        <w:t xml:space="preserve">2. Intelligence Dashboard: </w:t>
+      </w:r>
+      <w:r>
+        <w:t>Interactive command center presenting fraud trend lines, doughnut risk distribution, live scrolling threat feed, and force-directed graph analytics.</w:t>
       </w:r>
     </w:p>
     <w:p>
       <w:pPr>
         <w:pStyle w:val="ListBullet"/>
-        <w:spacing w:after="60"/>
+        <w:spacing w:after="80" w:line="276" w:lineRule="auto"/>
       </w:pPr>
       <w:r>
-        <w:t>3. Rational scrutiny drops significantly, making the victim highly susceptible to instructions such as transferring funds to 'government verification accounts'.</w:t>
+        <w:rPr>
+          <w:b/>
+          <w:color w:val="0A192F"/>
+        </w:rPr>
+        <w:t xml:space="preserve">3. Citizen Fraud Shield: </w:t>
+      </w:r>
+      <w:r>
+        <w:t>Conversational scanner where citizens paste suspicious messages or URLs to receive immediate risk verdicts, advice, and 1-click police reporting links.</w:t>
       </w:r>
     </w:p>
     <w:p>
+      <w:pPr>
+        <w:pStyle w:val="ListBullet"/>
+        <w:spacing w:after="80" w:line="276" w:lineRule="auto"/>
+      </w:pPr>
       <w:r>
-        <w:t>ScamShield AI acts as an artificial prefrontal cortex guardrail. By displaying objective, mathematical risk meters and visual alerts, the platform interrupts the panic loop and forces analytical cognition to re-engage.</w:t>
+        <w:rPr>
+          <w:b/>
+          <w:color w:val="0A192F"/>
+        </w:rPr>
+        <w:t xml:space="preserve">4. Gamified Education: </w:t>
+      </w:r>
+      <w:r>
+        <w:t>Interactive 10-question scam awareness quiz integrated with a point rewards ecosystem (Bronze, Silver, Gold, Diamond tiers).</w:t>
       </w:r>
     </w:p>
     <w:p>
       <w:pPr>
         <w:keepNext/>
-        <w:spacing w:before="360" w:after="120"/>
+        <w:spacing w:before="440" w:after="160"/>
       </w:pPr>
       <w:r>
         <w:rPr>
           <w:rFonts w:ascii="Calibri" w:hAnsi="Calibri"/>
           <w:b/>
-          <w:color w:val="0F172A"/>
+          <w:color w:val="0A192F"/>
           <w:sz w:val="36"/>
         </w:rPr>
-        <w:t>3. System Architecture &amp; Data Engineering</w:t>
+        <w:t>Chapter 4: Technical Architecture &amp; System Engineering</w:t>
       </w:r>
     </w:p>
     <w:p>
       <w:r>
-        <w:t>ScamShield AI is engineered as a decoupled, multi-tiered architecture designed for low latency, high throughput, and zero single-point-of-failure operation.</w:t>
+        <w:t>The system is built on a decoupled, microservice-ready architecture designed for high scalability and zero friction.</w:t>
+      </w:r>
+    </w:p>
+    <w:tbl>
+      <w:tblPr>
+        <w:tblW w:type="auto" w:w="0"/>
+        <w:jc w:val="center"/>
+        <w:tblLook w:firstColumn="1" w:firstRow="1" w:lastColumn="0" w:lastRow="0" w:noHBand="0" w:noVBand="1" w:val="04A0"/>
+      </w:tblPr>
+      <w:tblGrid>
+        <w:gridCol w:w="3120"/>
+        <w:gridCol w:w="3120"/>
+        <w:gridCol w:w="3120"/>
+      </w:tblGrid>
+      <w:tr>
+        <w:tc>
+          <w:tcPr>
+            <w:tcW w:type="dxa" w:w="3120"/>
+            <w:tcMar>
+              <w:top w:w="140" w:type="dxa"/>
+              <w:bottom w:w="140" w:type="dxa"/>
+              <w:left w:w="180" w:type="dxa"/>
+              <w:right w:w="180" w:type="dxa"/>
+            </w:tcMar>
+            <w:shd w:fill="0A192F"/>
+          </w:tcPr>
+          <w:p>
+            <w:r>
+              <w:rPr>
+                <w:b/>
+                <w:color w:val="FFFFFF"/>
+              </w:rPr>
+              <w:t>Layer</w:t>
+            </w:r>
+          </w:p>
+        </w:tc>
+        <w:tc>
+          <w:tcPr>
+            <w:tcW w:type="dxa" w:w="3120"/>
+            <w:tcMar>
+              <w:top w:w="140" w:type="dxa"/>
+              <w:bottom w:w="140" w:type="dxa"/>
+              <w:left w:w="180" w:type="dxa"/>
+              <w:right w:w="180" w:type="dxa"/>
+            </w:tcMar>
+            <w:shd w:fill="0A192F"/>
+          </w:tcPr>
+          <w:p>
+            <w:r>
+              <w:rPr>
+                <w:b/>
+                <w:color w:val="FFFFFF"/>
+              </w:rPr>
+              <w:t>Technology Selection</w:t>
+            </w:r>
+          </w:p>
+        </w:tc>
+        <w:tc>
+          <w:tcPr>
+            <w:tcW w:type="dxa" w:w="3120"/>
+            <w:tcMar>
+              <w:top w:w="140" w:type="dxa"/>
+              <w:bottom w:w="140" w:type="dxa"/>
+              <w:left w:w="180" w:type="dxa"/>
+              <w:right w:w="180" w:type="dxa"/>
+            </w:tcMar>
+            <w:shd w:fill="0A192F"/>
+          </w:tcPr>
+          <w:p>
+            <w:r>
+              <w:rPr>
+                <w:b/>
+                <w:color w:val="FFFFFF"/>
+              </w:rPr>
+              <w:t>Technical Responsibility</w:t>
+            </w:r>
+          </w:p>
+        </w:tc>
+      </w:tr>
+      <w:tr>
+        <w:tc>
+          <w:tcPr>
+            <w:tcW w:type="dxa" w:w="3120"/>
+            <w:tcMar>
+              <w:top w:w="140" w:type="dxa"/>
+              <w:bottom w:w="140" w:type="dxa"/>
+              <w:left w:w="180" w:type="dxa"/>
+              <w:right w:w="180" w:type="dxa"/>
+            </w:tcMar>
+            <w:shd w:fill="FFFFFF"/>
+          </w:tcPr>
+          <w:p>
+            <w:r>
+              <w:t>Frontend UI</w:t>
+            </w:r>
+          </w:p>
+        </w:tc>
+        <w:tc>
+          <w:tcPr>
+            <w:tcW w:type="dxa" w:w="3120"/>
+            <w:tcMar>
+              <w:top w:w="140" w:type="dxa"/>
+              <w:bottom w:w="140" w:type="dxa"/>
+              <w:left w:w="180" w:type="dxa"/>
+              <w:right w:w="180" w:type="dxa"/>
+            </w:tcMar>
+            <w:shd w:fill="FFFFFF"/>
+          </w:tcPr>
+          <w:p>
+            <w:r>
+              <w:t>Next.js 14 (App Router), React 18, Tailwind CSS</w:t>
+            </w:r>
+          </w:p>
+        </w:tc>
+        <w:tc>
+          <w:tcPr>
+            <w:tcW w:type="dxa" w:w="3120"/>
+            <w:tcMar>
+              <w:top w:w="140" w:type="dxa"/>
+              <w:bottom w:w="140" w:type="dxa"/>
+              <w:left w:w="180" w:type="dxa"/>
+              <w:right w:w="180" w:type="dxa"/>
+            </w:tcMar>
+            <w:shd w:fill="FFFFFF"/>
+          </w:tcPr>
+          <w:p>
+            <w:r>
+              <w:t>Server-rendered responsive UI, glassmorphic design, custom SVG charts</w:t>
+            </w:r>
+          </w:p>
+        </w:tc>
+      </w:tr>
+      <w:tr>
+        <w:tc>
+          <w:tcPr>
+            <w:tcW w:type="dxa" w:w="3120"/>
+            <w:tcMar>
+              <w:top w:w="140" w:type="dxa"/>
+              <w:bottom w:w="140" w:type="dxa"/>
+              <w:left w:w="180" w:type="dxa"/>
+              <w:right w:w="180" w:type="dxa"/>
+            </w:tcMar>
+            <w:shd w:fill="F8FAFC"/>
+          </w:tcPr>
+          <w:p>
+            <w:r>
+              <w:t>Backend Core</w:t>
+            </w:r>
+          </w:p>
+        </w:tc>
+        <w:tc>
+          <w:tcPr>
+            <w:tcW w:type="dxa" w:w="3120"/>
+            <w:tcMar>
+              <w:top w:w="140" w:type="dxa"/>
+              <w:bottom w:w="140" w:type="dxa"/>
+              <w:left w:w="180" w:type="dxa"/>
+              <w:right w:w="180" w:type="dxa"/>
+            </w:tcMar>
+            <w:shd w:fill="F8FAFC"/>
+          </w:tcPr>
+          <w:p>
+            <w:r>
+              <w:t>FastAPI (Python 3.11), Uvicorn ASGI</w:t>
+            </w:r>
+          </w:p>
+        </w:tc>
+        <w:tc>
+          <w:tcPr>
+            <w:tcW w:type="dxa" w:w="3120"/>
+            <w:tcMar>
+              <w:top w:w="140" w:type="dxa"/>
+              <w:bottom w:w="140" w:type="dxa"/>
+              <w:left w:w="180" w:type="dxa"/>
+              <w:right w:w="180" w:type="dxa"/>
+            </w:tcMar>
+            <w:shd w:fill="F8FAFC"/>
+          </w:tcPr>
+          <w:p>
+            <w:r>
+              <w:t>Async REST endpoints, rate limiting, security headers, middleware stack</w:t>
+            </w:r>
+          </w:p>
+        </w:tc>
+      </w:tr>
+      <w:tr>
+        <w:tc>
+          <w:tcPr>
+            <w:tcW w:type="dxa" w:w="3120"/>
+            <w:tcMar>
+              <w:top w:w="140" w:type="dxa"/>
+              <w:bottom w:w="140" w:type="dxa"/>
+              <w:left w:w="180" w:type="dxa"/>
+              <w:right w:w="180" w:type="dxa"/>
+            </w:tcMar>
+            <w:shd w:fill="FFFFFF"/>
+          </w:tcPr>
+          <w:p>
+            <w:r>
+              <w:t>Real-Time Engine</w:t>
+            </w:r>
+          </w:p>
+        </w:tc>
+        <w:tc>
+          <w:tcPr>
+            <w:tcW w:type="dxa" w:w="3120"/>
+            <w:tcMar>
+              <w:top w:w="140" w:type="dxa"/>
+              <w:bottom w:w="140" w:type="dxa"/>
+              <w:left w:w="180" w:type="dxa"/>
+              <w:right w:w="180" w:type="dxa"/>
+            </w:tcMar>
+            <w:shd w:fill="FFFFFF"/>
+          </w:tcPr>
+          <w:p>
+            <w:r>
+              <w:t>Python WebSockets (websockets 14.1)</w:t>
+            </w:r>
+          </w:p>
+        </w:tc>
+        <w:tc>
+          <w:tcPr>
+            <w:tcW w:type="dxa" w:w="3120"/>
+            <w:tcMar>
+              <w:top w:w="140" w:type="dxa"/>
+              <w:bottom w:w="140" w:type="dxa"/>
+              <w:left w:w="180" w:type="dxa"/>
+              <w:right w:w="180" w:type="dxa"/>
+            </w:tcMar>
+            <w:shd w:fill="FFFFFF"/>
+          </w:tcPr>
+          <w:p>
+            <w:r>
+              <w:t>Bidirectional transcript streaming, JWT authentication, streaming NLP</w:t>
+            </w:r>
+          </w:p>
+        </w:tc>
+      </w:tr>
+      <w:tr>
+        <w:tc>
+          <w:tcPr>
+            <w:tcW w:type="dxa" w:w="3120"/>
+            <w:tcMar>
+              <w:top w:w="140" w:type="dxa"/>
+              <w:bottom w:w="140" w:type="dxa"/>
+              <w:left w:w="180" w:type="dxa"/>
+              <w:right w:w="180" w:type="dxa"/>
+            </w:tcMar>
+            <w:shd w:fill="F8FAFC"/>
+          </w:tcPr>
+          <w:p>
+            <w:r>
+              <w:t>AI Pipeline</w:t>
+            </w:r>
+          </w:p>
+        </w:tc>
+        <w:tc>
+          <w:tcPr>
+            <w:tcW w:type="dxa" w:w="3120"/>
+            <w:tcMar>
+              <w:top w:w="140" w:type="dxa"/>
+              <w:bottom w:w="140" w:type="dxa"/>
+              <w:left w:w="180" w:type="dxa"/>
+              <w:right w:w="180" w:type="dxa"/>
+            </w:tcMar>
+            <w:shd w:fill="F8FAFC"/>
+          </w:tcPr>
+          <w:p>
+            <w:r>
+              <w:t>Google Gemini 1.5, HuggingFace, Heuristic Rules</w:t>
+            </w:r>
+          </w:p>
+        </w:tc>
+        <w:tc>
+          <w:tcPr>
+            <w:tcW w:type="dxa" w:w="3120"/>
+            <w:tcMar>
+              <w:top w:w="140" w:type="dxa"/>
+              <w:bottom w:w="140" w:type="dxa"/>
+              <w:left w:w="180" w:type="dxa"/>
+              <w:right w:w="180" w:type="dxa"/>
+            </w:tcMar>
+            <w:shd w:fill="F8FAFC"/>
+          </w:tcPr>
+          <w:p>
+            <w:r>
+              <w:t>Three-tier fallback chain for zero-downtime threat analysis</w:t>
+            </w:r>
+          </w:p>
+        </w:tc>
+      </w:tr>
+      <w:tr>
+        <w:tc>
+          <w:tcPr>
+            <w:tcW w:type="dxa" w:w="3120"/>
+            <w:tcMar>
+              <w:top w:w="140" w:type="dxa"/>
+              <w:bottom w:w="140" w:type="dxa"/>
+              <w:left w:w="180" w:type="dxa"/>
+              <w:right w:w="180" w:type="dxa"/>
+            </w:tcMar>
+            <w:shd w:fill="FFFFFF"/>
+          </w:tcPr>
+          <w:p>
+            <w:r>
+              <w:t>Data &amp; Storage</w:t>
+            </w:r>
+          </w:p>
+        </w:tc>
+        <w:tc>
+          <w:tcPr>
+            <w:tcW w:type="dxa" w:w="3120"/>
+            <w:tcMar>
+              <w:top w:w="140" w:type="dxa"/>
+              <w:bottom w:w="140" w:type="dxa"/>
+              <w:left w:w="180" w:type="dxa"/>
+              <w:right w:w="180" w:type="dxa"/>
+            </w:tcMar>
+            <w:shd w:fill="FFFFFF"/>
+          </w:tcPr>
+          <w:p>
+            <w:r>
+              <w:t>PostgreSQL (Supabase), Redis 7</w:t>
+            </w:r>
+          </w:p>
+        </w:tc>
+        <w:tc>
+          <w:tcPr>
+            <w:tcW w:type="dxa" w:w="3120"/>
+            <w:tcMar>
+              <w:top w:w="140" w:type="dxa"/>
+              <w:bottom w:w="140" w:type="dxa"/>
+              <w:left w:w="180" w:type="dxa"/>
+              <w:right w:w="180" w:type="dxa"/>
+            </w:tcMar>
+            <w:shd w:fill="FFFFFF"/>
+          </w:tcPr>
+          <w:p>
+            <w:r>
+              <w:t>Persistent analytical metrics, session tokens, and threat node graphs</w:t>
+            </w:r>
+          </w:p>
+        </w:tc>
+      </w:tr>
+    </w:tbl>
+    <w:p>
+      <w:pPr>
+        <w:spacing w:after="160"/>
+      </w:pPr>
+    </w:p>
+    <w:p>
+      <w:pPr>
+        <w:keepNext/>
+        <w:spacing w:before="440" w:after="160"/>
+      </w:pPr>
+      <w:r>
+        <w:rPr>
+          <w:rFonts w:ascii="Calibri" w:hAnsi="Calibri"/>
+          <w:b/>
+          <w:color w:val="0A192F"/>
+          <w:sz w:val="36"/>
+        </w:rPr>
+        <w:t>Chapter 5: Artificial Intelligence &amp; NLP Scoring Mathematics</w:t>
+      </w:r>
+    </w:p>
+    <w:p>
+      <w:r>
+        <w:t>To ensure 100% operational availability regardless of third-party cloud outages, ScamShield AI implements a mathematical heuristic engine that evaluates inputs using four weighted risk vectors:</w:t>
+      </w:r>
+    </w:p>
+    <w:tbl>
+      <w:tblPr>
+        <w:tblW w:type="auto" w:w="0"/>
+        <w:jc w:val="center"/>
+        <w:tblLook w:firstColumn="1" w:firstRow="1" w:lastColumn="0" w:lastRow="0" w:noHBand="0" w:noVBand="1" w:val="04A0"/>
+      </w:tblPr>
+      <w:tblGrid>
+        <w:gridCol w:w="9360"/>
+      </w:tblGrid>
+      <w:tr>
+        <w:tc>
+          <w:tcPr>
+            <w:tcW w:type="dxa" w:w="9360"/>
+            <w:shd w:fill="F0F9FF"/>
+            <w:tcMar>
+              <w:top w:w="160" w:type="dxa"/>
+              <w:bottom w:w="160" w:type="dxa"/>
+              <w:left w:w="240" w:type="dxa"/>
+              <w:right w:w="200" w:type="dxa"/>
+            </w:tcMar>
+            <w:tcBorders>
+              <w:top w:val="none" w:sz="4" w:space="0" w:color="auto"/>
+              <w:left w:val="single" w:sz="24" w:space="0" w:color="0284C7"/>
+              <w:bottom w:val="none" w:sz="4" w:space="0" w:color="auto"/>
+              <w:right w:val="none" w:sz="4" w:space="0" w:color="auto"/>
+            </w:tcBorders>
+          </w:tcPr>
+          <w:p>
+            <w:pPr>
+              <w:spacing w:after="80"/>
+            </w:pPr>
+            <w:r>
+              <w:rPr>
+                <w:b/>
+                <w:color w:val="0284C7"/>
+                <w:sz w:val="20"/>
+              </w:rPr>
+              <w:t>💡 MATHEMATICAL HEURISTIC SCORING EQUATION</w:t>
+              <w:br/>
+            </w:r>
+            <w:r>
+              <w:rPr>
+                <w:i/>
+                <w:color w:val="1E293B"/>
+                <w:sz w:val="21"/>
+              </w:rPr>
+              <w:t>Formula:</w:t>
+              <w:br/>
+              <w:t>RiskScore = min(100, (w1 * V1) + (w2 * V2) + (w3 * V3) + (w4 * V4) + URLPenalty)</w:t>
+              <w:br/>
+              <w:br/>
+              <w:t>Weights: w1 = 30% (Authority Impersonation), w2 = 35% (Coercion/Legal Threat), w3 = 25% (Financial Demand), w4 = 10% (Urgency/Secrecy)</w:t>
+            </w:r>
+          </w:p>
+        </w:tc>
+      </w:tr>
+    </w:tbl>
+    <w:p>
+      <w:pPr>
+        <w:spacing w:after="120"/>
+      </w:pPr>
+    </w:p>
+    <w:p>
+      <w:pPr>
+        <w:pStyle w:val="ListBullet"/>
+        <w:spacing w:after="80" w:line="276" w:lineRule="auto"/>
+      </w:pPr>
+      <w:r>
+        <w:rPr>
+          <w:b/>
+          <w:color w:val="0A192F"/>
+        </w:rPr>
+        <w:t xml:space="preserve">Vector 1 (Authority Impersonation - 30%): </w:t>
+      </w:r>
+      <w:r>
+        <w:t>Matches keywords such as CBI, Police Officer, Customs Department, Aadhaar Cell.</w:t>
       </w:r>
     </w:p>
     <w:p>
       <w:pPr>
         <w:pStyle w:val="ListBullet"/>
-        <w:spacing w:after="60"/>
+        <w:spacing w:after="80" w:line="276" w:lineRule="auto"/>
       </w:pPr>
       <w:r>
-        <w:t>Frontend Layer: Built with Next.js 14 (App Router), TypeScript, and Tailwind CSS with custom glassmorphism styles.</w:t>
+        <w:rPr>
+          <w:b/>
+          <w:color w:val="0A192F"/>
+        </w:rPr>
+        <w:t xml:space="preserve">Vector 2 (Coercion &amp; Legal Threats - 35%): </w:t>
+      </w:r>
+      <w:r>
+        <w:t>Matches keywords such as digital arrest, Section 420, arrest warrant, money laundering.</w:t>
       </w:r>
     </w:p>
     <w:p>
       <w:pPr>
         <w:pStyle w:val="ListBullet"/>
-        <w:spacing w:after="60"/>
+        <w:spacing w:after="80" w:line="276" w:lineRule="auto"/>
       </w:pPr>
       <w:r>
-        <w:t>Backend Layer: Built with Python 3 and FastAPI, featuring asynchronous processing, rate limiting, and security middleware.</w:t>
+        <w:rPr>
+          <w:b/>
+          <w:color w:val="0A192F"/>
+        </w:rPr>
+        <w:t xml:space="preserve">Vector 3 (Financial Demand - 25%): </w:t>
+      </w:r>
+      <w:r>
+        <w:t>Matches keywords such as RBI verification, deposit money, UPI transfer, security fee.</w:t>
       </w:r>
     </w:p>
     <w:p>
       <w:pPr>
         <w:pStyle w:val="ListBullet"/>
-        <w:spacing w:after="60"/>
+        <w:spacing w:after="80" w:line="276" w:lineRule="auto"/>
       </w:pPr>
       <w:r>
-        <w:t>Real-Time Communication Layer: Bi-directional WebSocket channels for streaming speech transcripts and real-time risk scores.</w:t>
+        <w:rPr>
+          <w:b/>
+          <w:color w:val="0A192F"/>
+        </w:rPr>
+        <w:t xml:space="preserve">Vector 4 (Urgency &amp; Secrecy - 10%): </w:t>
+      </w:r>
+      <w:r>
+        <w:t>Matches keywords such as immediate action, within 30 minutes, do not inform family.</w:t>
+      </w:r>
+    </w:p>
+    <w:p>
+      <w:pPr>
+        <w:keepNext/>
+        <w:spacing w:before="440" w:after="160"/>
+      </w:pPr>
+      <w:r>
+        <w:rPr>
+          <w:rFonts w:ascii="Calibri" w:hAnsi="Calibri"/>
+          <w:b/>
+          <w:color w:val="0A192F"/>
+          <w:sz w:val="36"/>
+        </w:rPr>
+        <w:t>Chapter 6: Graph Theory &amp; Threat Intelligence Mathematics</w:t>
+      </w:r>
+    </w:p>
+    <w:p>
+      <w:r>
+        <w:t>The Threat Intelligence Dashboard features a custom, zero-dependency force-directed network graph mapping connections between suspect phone numbers, money mule bank accounts, and victim nodes.</w:t>
+      </w:r>
+    </w:p>
+    <w:p>
+      <w:r>
+        <w:t>Node physics are governed by dynamic force equations evaluated on every frame:</w:t>
       </w:r>
     </w:p>
     <w:p>
       <w:pPr>
         <w:pStyle w:val="ListBullet"/>
-        <w:spacing w:after="60"/>
+        <w:spacing w:after="80" w:line="276" w:lineRule="auto"/>
       </w:pPr>
       <w:r>
-        <w:t>AI Engine Layer: Multi-model pipeline featuring Google Gemini (primary), Hugging Face (secondary), and a local deterministic heuristic engine (fallback).</w:t>
+        <w:rPr>
+          <w:b/>
+          <w:color w:val="0A192F"/>
+        </w:rPr>
+        <w:t xml:space="preserve">Repulsive Force (Coulomb's Law): </w:t>
+      </w:r>
+      <w:r>
+        <w:t>Fr(i, j) = - (kr / ||r_ij||^2) * r_hat_ij   [kr = 5000]</w:t>
+      </w:r>
+    </w:p>
+    <w:p>
+      <w:pPr>
+        <w:pStyle w:val="ListBullet"/>
+        <w:spacing w:after="80" w:line="276" w:lineRule="auto"/>
+      </w:pPr>
+      <w:r>
+        <w:rPr>
+          <w:b/>
+          <w:color w:val="0A192F"/>
+        </w:rPr>
+        <w:t xml:space="preserve">Attractive Force (Hooke's Law): </w:t>
+      </w:r>
+      <w:r>
+        <w:t>Fa(i, j) = ka * (||r_ij|| - l0) * r_hat_ij   [ka = 0.05, l0 = 100]</w:t>
+      </w:r>
+    </w:p>
+    <w:p>
+      <w:r>
+        <w:t>This simulation forces unlinked suspect clusters apart while drawing interconnected criminal rings into distinct visual hubs.</w:t>
       </w:r>
     </w:p>
     <w:p>
       <w:pPr>
         <w:keepNext/>
-        <w:spacing w:before="360" w:after="120"/>
+        <w:spacing w:before="440" w:after="160"/>
       </w:pPr>
       <w:r>
         <w:rPr>
           <w:rFonts w:ascii="Calibri" w:hAnsi="Calibri"/>
           <w:b/>
-          <w:color w:val="0F172A"/>
+          <w:color w:val="0A192F"/>
           <w:sz w:val="36"/>
         </w:rPr>
-        <w:t>4. AI Engine &amp; Real-Time NLP Pipeline</w:t>
+        <w:t>Chapter 7: Security Hardening &amp; Zero-Trust Architecture</w:t>
       </w:r>
     </w:p>
+    <w:tbl>
+      <w:tblPr>
+        <w:tblW w:type="auto" w:w="0"/>
+        <w:jc w:val="center"/>
+        <w:tblLook w:firstColumn="1" w:firstRow="1" w:lastColumn="0" w:lastRow="0" w:noHBand="0" w:noVBand="1" w:val="04A0"/>
+      </w:tblPr>
+      <w:tblGrid>
+        <w:gridCol w:w="3120"/>
+        <w:gridCol w:w="3120"/>
+        <w:gridCol w:w="3120"/>
+      </w:tblGrid>
+      <w:tr>
+        <w:tc>
+          <w:tcPr>
+            <w:tcW w:type="dxa" w:w="3120"/>
+            <w:tcMar>
+              <w:top w:w="140" w:type="dxa"/>
+              <w:bottom w:w="140" w:type="dxa"/>
+              <w:left w:w="180" w:type="dxa"/>
+              <w:right w:w="180" w:type="dxa"/>
+            </w:tcMar>
+            <w:shd w:fill="0A192F"/>
+          </w:tcPr>
+          <w:p>
+            <w:r>
+              <w:rPr>
+                <w:b/>
+                <w:color w:val="FFFFFF"/>
+              </w:rPr>
+              <w:t>Security Control</w:t>
+            </w:r>
+          </w:p>
+        </w:tc>
+        <w:tc>
+          <w:tcPr>
+            <w:tcW w:type="dxa" w:w="3120"/>
+            <w:tcMar>
+              <w:top w:w="140" w:type="dxa"/>
+              <w:bottom w:w="140" w:type="dxa"/>
+              <w:left w:w="180" w:type="dxa"/>
+              <w:right w:w="180" w:type="dxa"/>
+            </w:tcMar>
+            <w:shd w:fill="0A192F"/>
+          </w:tcPr>
+          <w:p>
+            <w:r>
+              <w:rPr>
+                <w:b/>
+                <w:color w:val="FFFFFF"/>
+              </w:rPr>
+              <w:t>Enforced Configuration Header</w:t>
+            </w:r>
+          </w:p>
+        </w:tc>
+        <w:tc>
+          <w:tcPr>
+            <w:tcW w:type="dxa" w:w="3120"/>
+            <w:tcMar>
+              <w:top w:w="140" w:type="dxa"/>
+              <w:bottom w:w="140" w:type="dxa"/>
+              <w:left w:w="180" w:type="dxa"/>
+              <w:right w:w="180" w:type="dxa"/>
+            </w:tcMar>
+            <w:shd w:fill="0A192F"/>
+          </w:tcPr>
+          <w:p>
+            <w:r>
+              <w:rPr>
+                <w:b/>
+                <w:color w:val="FFFFFF"/>
+              </w:rPr>
+              <w:t>Protection Impact</w:t>
+            </w:r>
+          </w:p>
+        </w:tc>
+      </w:tr>
+      <w:tr>
+        <w:tc>
+          <w:tcPr>
+            <w:tcW w:type="dxa" w:w="3120"/>
+            <w:tcMar>
+              <w:top w:w="140" w:type="dxa"/>
+              <w:bottom w:w="140" w:type="dxa"/>
+              <w:left w:w="180" w:type="dxa"/>
+              <w:right w:w="180" w:type="dxa"/>
+            </w:tcMar>
+            <w:shd w:fill="FFFFFF"/>
+          </w:tcPr>
+          <w:p>
+            <w:r>
+              <w:t>Frame Security</w:t>
+            </w:r>
+          </w:p>
+        </w:tc>
+        <w:tc>
+          <w:tcPr>
+            <w:tcW w:type="dxa" w:w="3120"/>
+            <w:tcMar>
+              <w:top w:w="140" w:type="dxa"/>
+              <w:bottom w:w="140" w:type="dxa"/>
+              <w:left w:w="180" w:type="dxa"/>
+              <w:right w:w="180" w:type="dxa"/>
+            </w:tcMar>
+            <w:shd w:fill="FFFFFF"/>
+          </w:tcPr>
+          <w:p>
+            <w:r>
+              <w:t>X-Frame-Options: DENY</w:t>
+            </w:r>
+          </w:p>
+        </w:tc>
+        <w:tc>
+          <w:tcPr>
+            <w:tcW w:type="dxa" w:w="3120"/>
+            <w:tcMar>
+              <w:top w:w="140" w:type="dxa"/>
+              <w:bottom w:w="140" w:type="dxa"/>
+              <w:left w:w="180" w:type="dxa"/>
+              <w:right w:w="180" w:type="dxa"/>
+            </w:tcMar>
+            <w:shd w:fill="FFFFFF"/>
+          </w:tcPr>
+          <w:p>
+            <w:r>
+              <w:t>Completely prevents clickjacking and iframe embedding</w:t>
+            </w:r>
+          </w:p>
+        </w:tc>
+      </w:tr>
+      <w:tr>
+        <w:tc>
+          <w:tcPr>
+            <w:tcW w:type="dxa" w:w="3120"/>
+            <w:tcMar>
+              <w:top w:w="140" w:type="dxa"/>
+              <w:bottom w:w="140" w:type="dxa"/>
+              <w:left w:w="180" w:type="dxa"/>
+              <w:right w:w="180" w:type="dxa"/>
+            </w:tcMar>
+            <w:shd w:fill="F8FAFC"/>
+          </w:tcPr>
+          <w:p>
+            <w:r>
+              <w:t>MIME Sniffing</w:t>
+            </w:r>
+          </w:p>
+        </w:tc>
+        <w:tc>
+          <w:tcPr>
+            <w:tcW w:type="dxa" w:w="3120"/>
+            <w:tcMar>
+              <w:top w:w="140" w:type="dxa"/>
+              <w:bottom w:w="140" w:type="dxa"/>
+              <w:left w:w="180" w:type="dxa"/>
+              <w:right w:w="180" w:type="dxa"/>
+            </w:tcMar>
+            <w:shd w:fill="F8FAFC"/>
+          </w:tcPr>
+          <w:p>
+            <w:r>
+              <w:t>X-Content-Type-Options: nosniff</w:t>
+            </w:r>
+          </w:p>
+        </w:tc>
+        <w:tc>
+          <w:tcPr>
+            <w:tcW w:type="dxa" w:w="3120"/>
+            <w:tcMar>
+              <w:top w:w="140" w:type="dxa"/>
+              <w:bottom w:w="140" w:type="dxa"/>
+              <w:left w:w="180" w:type="dxa"/>
+              <w:right w:w="180" w:type="dxa"/>
+            </w:tcMar>
+            <w:shd w:fill="F8FAFC"/>
+          </w:tcPr>
+          <w:p>
+            <w:r>
+              <w:t>Prevents malicious file content type spoofing</w:t>
+            </w:r>
+          </w:p>
+        </w:tc>
+      </w:tr>
+      <w:tr>
+        <w:tc>
+          <w:tcPr>
+            <w:tcW w:type="dxa" w:w="3120"/>
+            <w:tcMar>
+              <w:top w:w="140" w:type="dxa"/>
+              <w:bottom w:w="140" w:type="dxa"/>
+              <w:left w:w="180" w:type="dxa"/>
+              <w:right w:w="180" w:type="dxa"/>
+            </w:tcMar>
+            <w:shd w:fill="FFFFFF"/>
+          </w:tcPr>
+          <w:p>
+            <w:r>
+              <w:t>Transport Security</w:t>
+            </w:r>
+          </w:p>
+        </w:tc>
+        <w:tc>
+          <w:tcPr>
+            <w:tcW w:type="dxa" w:w="3120"/>
+            <w:tcMar>
+              <w:top w:w="140" w:type="dxa"/>
+              <w:bottom w:w="140" w:type="dxa"/>
+              <w:left w:w="180" w:type="dxa"/>
+              <w:right w:w="180" w:type="dxa"/>
+            </w:tcMar>
+            <w:shd w:fill="FFFFFF"/>
+          </w:tcPr>
+          <w:p>
+            <w:r>
+              <w:t>Strict-Transport-Security: max-age=63072000</w:t>
+            </w:r>
+          </w:p>
+        </w:tc>
+        <w:tc>
+          <w:tcPr>
+            <w:tcW w:type="dxa" w:w="3120"/>
+            <w:tcMar>
+              <w:top w:w="140" w:type="dxa"/>
+              <w:bottom w:w="140" w:type="dxa"/>
+              <w:left w:w="180" w:type="dxa"/>
+              <w:right w:w="180" w:type="dxa"/>
+            </w:tcMar>
+            <w:shd w:fill="FFFFFF"/>
+          </w:tcPr>
+          <w:p>
+            <w:r>
+              <w:t>Forces HTTPS connections for 2 years</w:t>
+            </w:r>
+          </w:p>
+        </w:tc>
+      </w:tr>
+      <w:tr>
+        <w:tc>
+          <w:tcPr>
+            <w:tcW w:type="dxa" w:w="3120"/>
+            <w:tcMar>
+              <w:top w:w="140" w:type="dxa"/>
+              <w:bottom w:w="140" w:type="dxa"/>
+              <w:left w:w="180" w:type="dxa"/>
+              <w:right w:w="180" w:type="dxa"/>
+            </w:tcMar>
+            <w:shd w:fill="F8FAFC"/>
+          </w:tcPr>
+          <w:p>
+            <w:r>
+              <w:t>Feature Control</w:t>
+            </w:r>
+          </w:p>
+        </w:tc>
+        <w:tc>
+          <w:tcPr>
+            <w:tcW w:type="dxa" w:w="3120"/>
+            <w:tcMar>
+              <w:top w:w="140" w:type="dxa"/>
+              <w:bottom w:w="140" w:type="dxa"/>
+              <w:left w:w="180" w:type="dxa"/>
+              <w:right w:w="180" w:type="dxa"/>
+            </w:tcMar>
+            <w:shd w:fill="F8FAFC"/>
+          </w:tcPr>
+          <w:p>
+            <w:r>
+              <w:t>Permissions-Policy: camera=(), mic=()</w:t>
+            </w:r>
+          </w:p>
+        </w:tc>
+        <w:tc>
+          <w:tcPr>
+            <w:tcW w:type="dxa" w:w="3120"/>
+            <w:tcMar>
+              <w:top w:w="140" w:type="dxa"/>
+              <w:bottom w:w="140" w:type="dxa"/>
+              <w:left w:w="180" w:type="dxa"/>
+              <w:right w:w="180" w:type="dxa"/>
+            </w:tcMar>
+            <w:shd w:fill="F8FAFC"/>
+          </w:tcPr>
+          <w:p>
+            <w:r>
+              <w:t>Disables unauthorized hardware device access</w:t>
+            </w:r>
+          </w:p>
+        </w:tc>
+      </w:tr>
+      <w:tr>
+        <w:tc>
+          <w:tcPr>
+            <w:tcW w:type="dxa" w:w="3120"/>
+            <w:tcMar>
+              <w:top w:w="140" w:type="dxa"/>
+              <w:bottom w:w="140" w:type="dxa"/>
+              <w:left w:w="180" w:type="dxa"/>
+              <w:right w:w="180" w:type="dxa"/>
+            </w:tcMar>
+            <w:shd w:fill="FFFFFF"/>
+          </w:tcPr>
+          <w:p>
+            <w:r>
+              <w:t>Rate Limiting</w:t>
+            </w:r>
+          </w:p>
+        </w:tc>
+        <w:tc>
+          <w:tcPr>
+            <w:tcW w:type="dxa" w:w="3120"/>
+            <w:tcMar>
+              <w:top w:w="140" w:type="dxa"/>
+              <w:bottom w:w="140" w:type="dxa"/>
+              <w:left w:w="180" w:type="dxa"/>
+              <w:right w:w="180" w:type="dxa"/>
+            </w:tcMar>
+            <w:shd w:fill="FFFFFF"/>
+          </w:tcPr>
+          <w:p>
+            <w:r>
+              <w:t>SlowAPI Limiter: 60 req/min per IP</w:t>
+            </w:r>
+          </w:p>
+        </w:tc>
+        <w:tc>
+          <w:tcPr>
+            <w:tcW w:type="dxa" w:w="3120"/>
+            <w:tcMar>
+              <w:top w:w="140" w:type="dxa"/>
+              <w:bottom w:w="140" w:type="dxa"/>
+              <w:left w:w="180" w:type="dxa"/>
+              <w:right w:w="180" w:type="dxa"/>
+            </w:tcMar>
+            <w:shd w:fill="FFFFFF"/>
+          </w:tcPr>
+          <w:p>
+            <w:r>
+              <w:t>Mitigates automated bot scanning and brute force attempts</w:t>
+            </w:r>
+          </w:p>
+        </w:tc>
+      </w:tr>
+    </w:tbl>
     <w:p>
+      <w:pPr>
+        <w:spacing w:after="160"/>
+      </w:pPr>
+    </w:p>
+    <w:p>
+      <w:pPr>
+        <w:keepNext/>
+        <w:spacing w:before="440" w:after="160"/>
+      </w:pPr>
       <w:r>
-        <w:t>The ScamAnalyzer service implements a three-tier fallback chain. If cloud APIs are unreachable, the local heuristic engine scores inputs based on four domain risk vectors:</w:t>
+        <w:rPr>
+          <w:rFonts w:ascii="Calibri" w:hAnsi="Calibri"/>
+          <w:b/>
+          <w:color w:val="0A192F"/>
+          <w:sz w:val="36"/>
+        </w:rPr>
+        <w:t>Chapter 8: Roadmap &amp; Projected Societal Impact</w:t>
       </w:r>
     </w:p>
     <w:p>
       <w:pPr>
         <w:pStyle w:val="ListBullet"/>
-        <w:spacing w:after="60"/>
+        <w:spacing w:after="80" w:line="276" w:lineRule="auto"/>
       </w:pPr>
       <w:r>
-        <w:t>Authority Impersonation Vector (Weight 30%): Matches phrases like CBI, Police, Customs, Supreme Court.</w:t>
+        <w:rPr>
+          <w:b/>
+          <w:color w:val="0A192F"/>
+        </w:rPr>
+        <w:t xml:space="preserve">Phase 1 (Immediate): </w:t>
+      </w:r>
+      <w:r>
+        <w:t>Deploy production frontend on Vercel and backend on Render.</w:t>
       </w:r>
     </w:p>
     <w:p>
       <w:pPr>
         <w:pStyle w:val="ListBullet"/>
-        <w:spacing w:after="60"/>
+        <w:spacing w:after="80" w:line="276" w:lineRule="auto"/>
       </w:pPr>
       <w:r>
-        <w:t>Coercion &amp; Legal Threats Vector (Weight 35%): Matches phrases like digital arrest, non-bailable warrant, Section 420.</w:t>
+        <w:rPr>
+          <w:b/>
+          <w:color w:val="0A192F"/>
+        </w:rPr>
+        <w:t xml:space="preserve">Phase 2 (Q3 2026): </w:t>
+      </w:r>
+      <w:r>
+        <w:t>Expand regional language AI engines for Tamil, Telugu, Marathi, and Bengali.</w:t>
       </w:r>
     </w:p>
     <w:p>
       <w:pPr>
         <w:pStyle w:val="ListBullet"/>
-        <w:spacing w:after="60"/>
+        <w:spacing w:after="80" w:line="276" w:lineRule="auto"/>
       </w:pPr>
       <w:r>
-        <w:t>Financial Demand Vector (Weight 25%): Matches phrases like verification account, UPI deposit, security fee.</w:t>
+        <w:rPr>
+          <w:b/>
+          <w:color w:val="0A192F"/>
+        </w:rPr>
+        <w:t xml:space="preserve">Phase 3 (Q4 2026): </w:t>
+      </w:r>
+      <w:r>
+        <w:t>Partner with telecom operators for automated network-level call header warnings.</w:t>
       </w:r>
     </w:p>
     <w:p>
       <w:pPr>
         <w:pStyle w:val="ListBullet"/>
-        <w:spacing w:after="60"/>
-      </w:pPr>
-      <w:r>
-        <w:t>Urgency &amp; Secrecy Vector (Weight 10%): Matches phrases like immediate, keep quiet, do not disconnect.</w:t>
-      </w:r>
-    </w:p>
-    <w:p>
-      <w:pPr>
-        <w:keepNext/>
-        <w:spacing w:before="360" w:after="120"/>
+        <w:spacing w:after="80" w:line="276" w:lineRule="auto"/>
       </w:pPr>
       <w:r>
         <w:rPr>
-          <w:rFonts w:ascii="Calibri" w:hAnsi="Calibri"/>
           <w:b/>
-          <w:color w:val="0F172A"/>
-          <w:sz w:val="36"/>
+          <w:color w:val="0A192F"/>
         </w:rPr>
-        <w:t>5. Graph Theory &amp; Threat Intelligence Mathematics</w:t>
+        <w:t xml:space="preserve">Phase 4 (2027): </w:t>
+      </w:r>
+      <w:r>
+        <w:t>Direct API integration with National Cybercrime Reporting Portal (1930).</w:t>
       </w:r>
     </w:p>
-    <w:p>
-      <w:r>
-        <w:t>The Threat Intelligence Dashboard incorporates an interactive force-directed graph to map fraud networks. Node coordinates are dynamically calculated using Coulomb repulsion and Hooke spring attraction physics:</w:t>
-      </w:r>
-    </w:p>
-    <w:p>
-      <w:r>
-        <w:t>Repulsive Force (Coulomb's Law): Fr(i, j) = - (kr / ||r_ij||^2) * r_hat_ij</w:t>
-        <w:br/>
-        <w:t>Attractive Force (Hooke's Law): Fa(i, j) = ka * (||r_ij|| - l0) * r_hat_ij</w:t>
-      </w:r>
-    </w:p>
-    <w:p>
-      <w:r>
-        <w:t>Where kr = 5000 is the repulsion constant, ka = 0.05 is spring stiffness, and l0 = 100 is edge rest length.</w:t>
-      </w:r>
-    </w:p>
+    <w:tbl>
+      <w:tblPr>
+        <w:tblW w:type="auto" w:w="0"/>
+        <w:jc w:val="center"/>
+        <w:tblLook w:firstColumn="1" w:firstRow="1" w:lastColumn="0" w:lastRow="0" w:noHBand="0" w:noVBand="1" w:val="04A0"/>
+      </w:tblPr>
+      <w:tblGrid>
+        <w:gridCol w:w="9360"/>
+      </w:tblGrid>
+      <w:tr>
+        <w:tc>
+          <w:tcPr>
+            <w:tcW w:type="dxa" w:w="9360"/>
+            <w:shd w:fill="F0F9FF"/>
+            <w:tcMar>
+              <w:top w:w="160" w:type="dxa"/>
+              <w:bottom w:w="160" w:type="dxa"/>
+              <w:left w:w="240" w:type="dxa"/>
+              <w:right w:w="200" w:type="dxa"/>
+            </w:tcMar>
+            <w:tcBorders>
+              <w:top w:val="none" w:sz="4" w:space="0" w:color="auto"/>
+              <w:left w:val="single" w:sz="24" w:space="0" w:color="0284C7"/>
+              <w:bottom w:val="none" w:sz="4" w:space="0" w:color="auto"/>
+              <w:right w:val="none" w:sz="4" w:space="0" w:color="auto"/>
+            </w:tcBorders>
+          </w:tcPr>
+          <w:p>
+            <w:pPr>
+              <w:spacing w:after="80"/>
+            </w:pPr>
+            <w:r>
+              <w:rPr>
+                <w:b/>
+                <w:color w:val="0284C7"/>
+                <w:sz w:val="20"/>
+              </w:rPr>
+              <w:t>💡 PROJECTED FIRST-YEAR SOCIETAL ROI</w:t>
+              <w:br/>
+            </w:r>
+            <w:r>
+              <w:rPr>
+                <w:i/>
+                <w:color w:val="1E293B"/>
+                <w:sz w:val="21"/>
+              </w:rPr>
+              <w:t>By intercepting scam calls mid-conversation, ScamShield AI projects a reduction of over ₹32 Crore in prevented financial losses across 50,000+ protected citizens in its first year of operation.</w:t>
+            </w:r>
+          </w:p>
+        </w:tc>
+      </w:tr>
+    </w:tbl>
     <w:p>
       <w:pPr>
-        <w:keepNext/>
-        <w:spacing w:before="360" w:after="120"/>
+        <w:spacing w:after="120"/>
       </w:pPr>
-      <w:r>
-        <w:rPr>
-          <w:rFonts w:ascii="Calibri" w:hAnsi="Calibri"/>
-          <w:b/>
-          <w:color w:val="0F172A"/>
-          <w:sz w:val="36"/>
-        </w:rPr>
-        <w:t>6. Gamification &amp; Behavior Change Engine</w:t>
-      </w:r>
-    </w:p>
-    <w:p>
-      <w:r>
-        <w:t>To transform passive users into active fraud detectors, ScamShield AI implements an incentive mechanics loop:</w:t>
-      </w:r>
-    </w:p>
-    <w:p>
-      <w:pPr>
-        <w:pStyle w:val="ListBullet"/>
-        <w:spacing w:after="60"/>
-      </w:pPr>
-      <w:r>
-        <w:t>Scan Message: +10 Points</w:t>
-      </w:r>
-    </w:p>
-    <w:p>
-      <w:pPr>
-        <w:pStyle w:val="ListBullet"/>
-        <w:spacing w:after="60"/>
-      </w:pPr>
-      <w:r>
-        <w:t>Share Fraud Alert on WhatsApp: +15 Points</w:t>
-      </w:r>
-    </w:p>
-    <w:p>
-      <w:pPr>
-        <w:pStyle w:val="ListBullet"/>
-        <w:spacing w:after="60"/>
-      </w:pPr>
-      <w:r>
-        <w:t>Quiz Correct Answer: +20 Points</w:t>
-      </w:r>
-    </w:p>
-    <w:p>
-      <w:pPr>
-        <w:pStyle w:val="ListBullet"/>
-        <w:spacing w:after="60"/>
-      </w:pPr>
-      <w:r>
-        <w:t>Complete Full Quiz: +50 Points</w:t>
-      </w:r>
-    </w:p>
-    <w:p>
-      <w:pPr>
-        <w:pStyle w:val="ListBullet"/>
-        <w:spacing w:after="60"/>
-      </w:pPr>
-      <w:r>
-        <w:t>Submit Verified Report to Authorities: +25 Points</w:t>
-      </w:r>
-    </w:p>
-    <w:p>
-      <w:pPr>
-        <w:keepNext/>
-        <w:spacing w:before="360" w:after="120"/>
-      </w:pPr>
-      <w:r>
-        <w:rPr>
-          <w:rFonts w:ascii="Calibri" w:hAnsi="Calibri"/>
-          <w:b/>
-          <w:color w:val="0F172A"/>
-          <w:sz w:val="36"/>
-        </w:rPr>
-        <w:t>7. Security Hardening &amp; Threat Model</w:t>
-      </w:r>
-    </w:p>
-    <w:p>
-      <w:r>
-        <w:t>ScamShield AI enforces strict HTTP security headers (X-Frame-Options DENY, X-Content-Type-Options nosniff, Permissions-Policy, HSTS), origin-restricted CORS policies, per-IP rate limiting (SlowAPI), and short-lived JWT tokens for WebSocket connections.</w:t>
-      </w:r>
     </w:p>
     <w:sectPr>
       <w:pgSz w:w="12240" w:h="15840"/>

</xml_diff>